<commit_message>
[FIX] reporting feature and examples working again
</commit_message>
<xml_diff>
--- a/templates/Demo Word Report.docx
+++ b/templates/Demo Word Report.docx
@@ -261,52 +261,6 @@
             <w:r>
               <w:rPr/>
               <w:t>Request received by the SOC</w:t>
-            </w:r>
-          </w:p>
-        </w:tc>
-      </w:tr>
-      <w:tr>
-        <w:trPr/>
-        <w:tc>
-          <w:tcPr>
-            <w:tcW w:w="4818" w:type="dxa"/>
-            <w:tcBorders>
-              <w:start w:val="single" w:sz="4" w:space="0" w:color="000000"/>
-              <w:bottom w:val="single" w:sz="4" w:space="0" w:color="000000"/>
-            </w:tcBorders>
-          </w:tcPr>
-          <w:p>
-            <w:pPr>
-              <w:pStyle w:val="TableContents"/>
-              <w:bidi w:val="0"/>
-              <w:jc w:val="start"/>
-              <w:rPr/>
-            </w:pPr>
-            <w:r>
-              <w:rPr/>
-              <w:t>{{ .Case.DateAdded.Format “2006-01-02” }}</w:t>
-            </w:r>
-          </w:p>
-        </w:tc>
-        <w:tc>
-          <w:tcPr>
-            <w:tcW w:w="4820" w:type="dxa"/>
-            <w:tcBorders>
-              <w:start w:val="single" w:sz="4" w:space="0" w:color="000000"/>
-              <w:bottom w:val="single" w:sz="4" w:space="0" w:color="000000"/>
-              <w:end w:val="single" w:sz="4" w:space="0" w:color="000000"/>
-            </w:tcBorders>
-          </w:tcPr>
-          <w:p>
-            <w:pPr>
-              <w:pStyle w:val="TableContents"/>
-              <w:bidi w:val="0"/>
-              <w:jc w:val="start"/>
-              <w:rPr/>
-            </w:pPr>
-            <w:r>
-              <w:rPr/>
-              <w:t>Start of analysis</w:t>
             </w:r>
           </w:p>
         </w:tc>
@@ -499,7 +453,7 @@
                 <w:b/>
                 <w:bCs/>
               </w:rPr>
-              <w:t>Compromised</w:t>
+              <w:t>Status</w:t>
             </w:r>
           </w:p>
         </w:tc>
@@ -528,7 +482,7 @@
                 <w:b/>
                 <w:bCs/>
               </w:rPr>
-              <w:t>Description</w:t>
+              <w:t>Notes</w:t>
             </w:r>
           </w:p>
         </w:tc>
@@ -620,7 +574,15 @@
             </w:pPr>
             <w:r>
               <w:rPr/>
-              <w:t>{{ .Compromised }}</w:t>
+              <w:t>{{ .</w:t>
+            </w:r>
+            <w:r>
+              <w:rPr/>
+              <w:t>Status</w:t>
+            </w:r>
+            <w:r>
+              <w:rPr/>
+              <w:t xml:space="preserve"> }}</w:t>
             </w:r>
           </w:p>
         </w:tc>
@@ -642,7 +604,15 @@
             </w:pPr>
             <w:r>
               <w:rPr/>
-              <w:t>{{ .Description }}</w:t>
+              <w:t>{{ .</w:t>
+            </w:r>
+            <w:r>
+              <w:rPr/>
+              <w:t>Notes</w:t>
+            </w:r>
+            <w:r>
+              <w:rPr/>
+              <w:t xml:space="preserve"> }}</w:t>
             </w:r>
           </w:p>
         </w:tc>
@@ -718,7 +688,31 @@
       </w:pPr>
       <w:r>
         <w:rPr/>
-        <w:t>{{p if .Compromised }}</w:t>
+        <w:t>{{p</w:t>
+      </w:r>
+      <w:r>
+        <w:rPr/>
+        <w:t xml:space="preserve"> </w:t>
+      </w:r>
+      <w:r>
+        <w:rPr/>
+        <w:t xml:space="preserve">if </w:t>
+      </w:r>
+      <w:r>
+        <w:rPr/>
+        <w:t xml:space="preserve">eq </w:t>
+      </w:r>
+      <w:r>
+        <w:rPr/>
+        <w:t>.</w:t>
+      </w:r>
+      <w:r>
+        <w:rPr/>
+        <w:t>Status “Compromised”</w:t>
+      </w:r>
+      <w:r>
+        <w:rPr/>
+        <w:t xml:space="preserve"> }}</w:t>
       </w:r>
     </w:p>
     <w:p>
@@ -779,7 +773,7 @@
     </w:p>
     <w:tbl>
       <w:tblPr>
-        <w:tblW w:w="5000" w:type="pct"/>
+        <w:tblW w:w="9633" w:type="dxa"/>
         <w:jc w:val="start"/>
         <w:tblInd w:w="-5" w:type="dxa"/>
         <w:tblLayout w:type="fixed"/>
@@ -791,16 +785,15 @@
         </w:tblCellMar>
       </w:tblPr>
       <w:tblGrid>
-        <w:gridCol w:w="2409"/>
-        <w:gridCol w:w="2409"/>
-        <w:gridCol w:w="2410"/>
-        <w:gridCol w:w="2410"/>
+        <w:gridCol w:w="3211"/>
+        <w:gridCol w:w="3211"/>
+        <w:gridCol w:w="3211"/>
       </w:tblGrid>
       <w:tr>
         <w:trPr/>
         <w:tc>
           <w:tcPr>
-            <w:tcW w:w="2409" w:type="dxa"/>
+            <w:tcW w:w="3211" w:type="dxa"/>
             <w:tcBorders>
               <w:top w:val="single" w:sz="4" w:space="0" w:color="000000"/>
               <w:start w:val="single" w:sz="4" w:space="0" w:color="000000"/>
@@ -812,17 +805,23 @@
               <w:pStyle w:val="TableContents"/>
               <w:bidi w:val="0"/>
               <w:jc w:val="start"/>
-              <w:rPr/>
-            </w:pPr>
-            <w:r>
-              <w:rPr/>
+              <w:rPr>
+                <w:b/>
+                <w:bCs/>
+              </w:rPr>
+            </w:pPr>
+            <w:r>
+              <w:rPr>
+                <w:b/>
+                <w:bCs/>
+              </w:rPr>
               <w:t>Date</w:t>
             </w:r>
           </w:p>
         </w:tc>
         <w:tc>
           <w:tcPr>
-            <w:tcW w:w="2409" w:type="dxa"/>
+            <w:tcW w:w="3211" w:type="dxa"/>
             <w:tcBorders>
               <w:top w:val="single" w:sz="4" w:space="0" w:color="000000"/>
               <w:start w:val="single" w:sz="4" w:space="0" w:color="000000"/>
@@ -834,43 +833,27 @@
               <w:pStyle w:val="TableContents"/>
               <w:bidi w:val="0"/>
               <w:jc w:val="start"/>
-              <w:rPr/>
-            </w:pPr>
-            <w:r>
-              <w:rPr/>
+              <w:rPr>
+                <w:b/>
+                <w:bCs/>
+              </w:rPr>
+            </w:pPr>
+            <w:r>
+              <w:rPr>
+                <w:b/>
+                <w:bCs/>
+              </w:rPr>
               <w:t>Category</w:t>
             </w:r>
           </w:p>
         </w:tc>
         <w:tc>
           <w:tcPr>
-            <w:tcW w:w="2410" w:type="dxa"/>
+            <w:tcW w:w="3211" w:type="dxa"/>
             <w:tcBorders>
               <w:top w:val="single" w:sz="4" w:space="0" w:color="000000"/>
               <w:start w:val="single" w:sz="4" w:space="0" w:color="000000"/>
               <w:bottom w:val="single" w:sz="4" w:space="0" w:color="000000"/>
-            </w:tcBorders>
-          </w:tcPr>
-          <w:p>
-            <w:pPr>
-              <w:pStyle w:val="TableContents"/>
-              <w:bidi w:val="0"/>
-              <w:jc w:val="start"/>
-              <w:rPr/>
-            </w:pPr>
-            <w:r>
-              <w:rPr/>
-              <w:t>Assets</w:t>
-            </w:r>
-          </w:p>
-        </w:tc>
-        <w:tc>
-          <w:tcPr>
-            <w:tcW w:w="2410" w:type="dxa"/>
-            <w:tcBorders>
-              <w:top w:val="single" w:sz="4" w:space="0" w:color="000000"/>
-              <w:start w:val="single" w:sz="4" w:space="0" w:color="000000"/>
-              <w:bottom w:val="single" w:sz="4" w:space="0" w:color="000000"/>
               <w:end w:val="single" w:sz="4" w:space="0" w:color="000000"/>
             </w:tcBorders>
           </w:tcPr>
@@ -879,10 +862,16 @@
               <w:pStyle w:val="TableContents"/>
               <w:bidi w:val="0"/>
               <w:jc w:val="start"/>
-              <w:rPr/>
-            </w:pPr>
-            <w:r>
-              <w:rPr/>
+              <w:rPr>
+                <w:b/>
+                <w:bCs/>
+              </w:rPr>
+            </w:pPr>
+            <w:r>
+              <w:rPr>
+                <w:b/>
+                <w:bCs/>
+              </w:rPr>
               <w:t>Event</w:t>
             </w:r>
           </w:p>
@@ -892,8 +881,8 @@
         <w:trPr/>
         <w:tc>
           <w:tcPr>
-            <w:tcW w:w="9638" w:type="dxa"/>
-            <w:gridSpan w:val="4"/>
+            <w:tcW w:w="9633" w:type="dxa"/>
+            <w:gridSpan w:val="3"/>
             <w:tcBorders>
               <w:start w:val="single" w:sz="4" w:space="0" w:color="000000"/>
               <w:bottom w:val="single" w:sz="4" w:space="0" w:color="000000"/>
@@ -918,7 +907,7 @@
         <w:trPr/>
         <w:tc>
           <w:tcPr>
-            <w:tcW w:w="2409" w:type="dxa"/>
+            <w:tcW w:w="3211" w:type="dxa"/>
             <w:tcBorders>
               <w:start w:val="single" w:sz="4" w:space="0" w:color="000000"/>
               <w:bottom w:val="single" w:sz="4" w:space="0" w:color="000000"/>
@@ -939,7 +928,7 @@
         </w:tc>
         <w:tc>
           <w:tcPr>
-            <w:tcW w:w="2409" w:type="dxa"/>
+            <w:tcW w:w="3211" w:type="dxa"/>
             <w:tcBorders>
               <w:start w:val="single" w:sz="4" w:space="0" w:color="000000"/>
               <w:bottom w:val="single" w:sz="4" w:space="0" w:color="000000"/>
@@ -960,28 +949,7 @@
         </w:tc>
         <w:tc>
           <w:tcPr>
-            <w:tcW w:w="2410" w:type="dxa"/>
-            <w:tcBorders>
-              <w:start w:val="single" w:sz="4" w:space="0" w:color="000000"/>
-              <w:bottom w:val="single" w:sz="4" w:space="0" w:color="000000"/>
-            </w:tcBorders>
-          </w:tcPr>
-          <w:p>
-            <w:pPr>
-              <w:pStyle w:val="TableContents"/>
-              <w:bidi w:val="0"/>
-              <w:jc w:val="start"/>
-              <w:rPr/>
-            </w:pPr>
-            <w:r>
-              <w:rPr/>
-              <w:t>{{ .AssetA }}{{ if .AssetB }}{{ .Direction}} {{ .AssetB }}{{ end }}</w:t>
-            </w:r>
-          </w:p>
-        </w:tc>
-        <w:tc>
-          <w:tcPr>
-            <w:tcW w:w="2410" w:type="dxa"/>
+            <w:tcW w:w="3211" w:type="dxa"/>
             <w:tcBorders>
               <w:start w:val="single" w:sz="4" w:space="0" w:color="000000"/>
               <w:bottom w:val="single" w:sz="4" w:space="0" w:color="000000"/>
@@ -997,7 +965,7 @@
             </w:pPr>
             <w:r>
               <w:rPr/>
-              <w:t>{{ html .Event}}</w:t>
+              <w:t>{{ .Event}}</w:t>
             </w:r>
           </w:p>
         </w:tc>
@@ -1006,8 +974,8 @@
         <w:trPr/>
         <w:tc>
           <w:tcPr>
-            <w:tcW w:w="9638" w:type="dxa"/>
-            <w:gridSpan w:val="4"/>
+            <w:tcW w:w="9633" w:type="dxa"/>
+            <w:gridSpan w:val="3"/>
             <w:tcBorders>
               <w:start w:val="single" w:sz="4" w:space="0" w:color="000000"/>
               <w:bottom w:val="single" w:sz="4" w:space="0" w:color="000000"/>
@@ -1141,7 +1109,7 @@
                 <w:b/>
                 <w:bCs/>
               </w:rPr>
-              <w:t>Date received</w:t>
+              <w:t>Hash</w:t>
             </w:r>
           </w:p>
         </w:tc>
@@ -1170,7 +1138,7 @@
                 <w:b/>
                 <w:bCs/>
               </w:rPr>
-              <w:t>Hash</w:t>
+              <w:t>Notes</w:t>
             </w:r>
           </w:p>
         </w:tc>
@@ -1241,7 +1209,7 @@
             </w:pPr>
             <w:r>
               <w:rPr/>
-              <w:t>{{ .DateAdded.Format “2006-01-02” }}</w:t>
+              <w:t>{{ .Hash }}</w:t>
             </w:r>
           </w:p>
         </w:tc>
@@ -1263,7 +1231,7 @@
             </w:pPr>
             <w:r>
               <w:rPr/>
-              <w:t>{{ .Hash }}</w:t>
+              <w:t>{{ .Notes }}</w:t>
             </w:r>
           </w:p>
         </w:tc>
@@ -1423,7 +1391,7 @@
                 <w:b/>
                 <w:bCs/>
               </w:rPr>
-              <w:t>Description</w:t>
+              <w:t>Notes</w:t>
             </w:r>
           </w:p>
         </w:tc>
@@ -1516,7 +1484,15 @@
             </w:pPr>
             <w:r>
               <w:rPr/>
-              <w:t>{{ .Description }}</w:t>
+              <w:t>{{ .</w:t>
+            </w:r>
+            <w:r>
+              <w:rPr/>
+              <w:t>Notes</w:t>
+            </w:r>
+            <w:r>
+              <w:rPr/>
+              <w:t xml:space="preserve"> }}</w:t>
             </w:r>
           </w:p>
         </w:tc>
@@ -1881,7 +1857,7 @@
     </w:rPr>
   </w:style>
   <w:style w:type="paragraph" w:styleId="Heading1">
-    <w:name w:val="Heading 1"/>
+    <w:name w:val="heading 1"/>
     <w:basedOn w:val="Heading"/>
     <w:next w:val="BodyText"/>
     <w:qFormat/>
@@ -1901,7 +1877,7 @@
     </w:rPr>
   </w:style>
   <w:style w:type="paragraph" w:styleId="Heading2">
-    <w:name w:val="Heading 2"/>
+    <w:name w:val="heading 2"/>
     <w:basedOn w:val="Heading"/>
     <w:next w:val="BodyText"/>
     <w:qFormat/>
@@ -1959,7 +1935,7 @@
     </w:rPr>
   </w:style>
   <w:style w:type="paragraph" w:styleId="Caption">
-    <w:name w:val="Caption"/>
+    <w:name w:val="caption"/>
     <w:basedOn w:val="Normal"/>
     <w:qFormat/>
     <w:pPr>
@@ -2023,6 +1999,19 @@
       <w:suppressLineNumbers/>
     </w:pPr>
     <w:rPr/>
+  </w:style>
+  <w:style w:type="paragraph" w:styleId="TableHeading">
+    <w:name w:val="Table Heading"/>
+    <w:basedOn w:val="TableContents"/>
+    <w:qFormat/>
+    <w:pPr>
+      <w:suppressLineNumbers/>
+      <w:jc w:val="center"/>
+    </w:pPr>
+    <w:rPr>
+      <w:b/>
+      <w:bCs/>
+    </w:rPr>
   </w:style>
 </w:styles>
 </file>

</xml_diff>

<commit_message>
Harden pkg/doct XML walker and rework pivot hoisting
</commit_message>
<xml_diff>
--- a/templates/Demo Word Report.docx
+++ b/templates/Demo Word Report.docx
@@ -43,6 +43,10 @@
     <w:p>
       <w:pPr>
         <w:pStyle w:val="Heading1"/>
+        <w:numPr>
+          <w:ilvl w:val="0"/>
+          <w:numId w:val="1"/>
+        </w:numPr>
         <w:bidi w:val="0"/>
         <w:ind w:hanging="0" w:start="0"/>
         <w:jc w:val="start"/>
@@ -94,7 +98,12 @@
     <w:p>
       <w:pPr>
         <w:pStyle w:val="Heading1"/>
-        <w:bidi w:val="0"/>
+        <w:numPr>
+          <w:ilvl w:val="0"/>
+          <w:numId w:val="1"/>
+        </w:numPr>
+        <w:bidi w:val="0"/>
+        <w:spacing w:before="0" w:after="120"/>
         <w:ind w:hanging="0" w:start="0"/>
         <w:jc w:val="start"/>
         <w:rPr/>
@@ -107,6 +116,10 @@
     <w:p>
       <w:pPr>
         <w:pStyle w:val="Heading2"/>
+        <w:numPr>
+          <w:ilvl w:val="1"/>
+          <w:numId w:val="1"/>
+        </w:numPr>
         <w:bidi w:val="0"/>
         <w:ind w:hanging="0" w:start="0"/>
         <w:jc w:val="start"/>
@@ -132,6 +145,10 @@
     <w:p>
       <w:pPr>
         <w:pStyle w:val="Heading2"/>
+        <w:numPr>
+          <w:ilvl w:val="1"/>
+          <w:numId w:val="1"/>
+        </w:numPr>
         <w:bidi w:val="0"/>
         <w:ind w:hanging="0" w:start="0"/>
         <w:jc w:val="start"/>
@@ -157,7 +174,7 @@
       </w:tblPr>
       <w:tblGrid>
         <w:gridCol w:w="4818"/>
-        <w:gridCol w:w="4820"/>
+        <w:gridCol w:w="4819"/>
       </w:tblGrid>
       <w:tr>
         <w:trPr/>
@@ -191,7 +208,7 @@
         </w:tc>
         <w:tc>
           <w:tcPr>
-            <w:tcW w:w="4820" w:type="dxa"/>
+            <w:tcW w:w="4819" w:type="dxa"/>
             <w:tcBorders>
               <w:top w:val="single" w:sz="4" w:space="0" w:color="000000"/>
               <w:start w:val="single" w:sz="4" w:space="0" w:color="000000"/>
@@ -244,7 +261,7 @@
         </w:tc>
         <w:tc>
           <w:tcPr>
-            <w:tcW w:w="4820" w:type="dxa"/>
+            <w:tcW w:w="4819" w:type="dxa"/>
             <w:tcBorders>
               <w:start w:val="single" w:sz="4" w:space="0" w:color="000000"/>
               <w:bottom w:val="single" w:sz="4" w:space="0" w:color="000000"/>
@@ -290,7 +307,7 @@
         </w:tc>
         <w:tc>
           <w:tcPr>
-            <w:tcW w:w="4820" w:type="dxa"/>
+            <w:tcW w:w="4819" w:type="dxa"/>
             <w:tcBorders>
               <w:start w:val="single" w:sz="4" w:space="0" w:color="000000"/>
               <w:bottom w:val="single" w:sz="4" w:space="0" w:color="000000"/>
@@ -330,7 +347,12 @@
     <w:p>
       <w:pPr>
         <w:pStyle w:val="Heading1"/>
-        <w:bidi w:val="0"/>
+        <w:numPr>
+          <w:ilvl w:val="0"/>
+          <w:numId w:val="1"/>
+        </w:numPr>
+        <w:bidi w:val="0"/>
+        <w:spacing w:before="0" w:after="120"/>
         <w:ind w:hanging="0" w:start="0"/>
         <w:jc w:val="start"/>
         <w:rPr/>
@@ -369,7 +391,7 @@
         <w:gridCol w:w="2409"/>
         <w:gridCol w:w="2409"/>
         <w:gridCol w:w="2410"/>
-        <w:gridCol w:w="2410"/>
+        <w:gridCol w:w="2409"/>
       </w:tblGrid>
       <w:tr>
         <w:trPr/>
@@ -459,7 +481,7 @@
         </w:tc>
         <w:tc>
           <w:tcPr>
-            <w:tcW w:w="2410" w:type="dxa"/>
+            <w:tcW w:w="2409" w:type="dxa"/>
             <w:tcBorders>
               <w:top w:val="single" w:sz="4" w:space="0" w:color="000000"/>
               <w:start w:val="single" w:sz="4" w:space="0" w:color="000000"/>
@@ -491,7 +513,7 @@
         <w:trPr/>
         <w:tc>
           <w:tcPr>
-            <w:tcW w:w="9638" w:type="dxa"/>
+            <w:tcW w:w="9637" w:type="dxa"/>
             <w:gridSpan w:val="4"/>
             <w:tcBorders>
               <w:start w:val="single" w:sz="4" w:space="0" w:color="000000"/>
@@ -508,7 +530,7 @@
             </w:pPr>
             <w:r>
               <w:rPr/>
-              <w:t>{{tr range .Case.Assets }}</w:t>
+              <w:t>{{ range .Case.Assets }}</w:t>
             </w:r>
           </w:p>
         </w:tc>
@@ -574,21 +596,13 @@
             </w:pPr>
             <w:r>
               <w:rPr/>
-              <w:t>{{ .</w:t>
-            </w:r>
-            <w:r>
-              <w:rPr/>
-              <w:t>Status</w:t>
-            </w:r>
-            <w:r>
-              <w:rPr/>
-              <w:t xml:space="preserve"> }}</w:t>
-            </w:r>
-          </w:p>
-        </w:tc>
-        <w:tc>
-          <w:tcPr>
-            <w:tcW w:w="2410" w:type="dxa"/>
+              <w:t>{{ .Status }}</w:t>
+            </w:r>
+          </w:p>
+        </w:tc>
+        <w:tc>
+          <w:tcPr>
+            <w:tcW w:w="2409" w:type="dxa"/>
             <w:tcBorders>
               <w:start w:val="single" w:sz="4" w:space="0" w:color="000000"/>
               <w:bottom w:val="single" w:sz="4" w:space="0" w:color="000000"/>
@@ -604,15 +618,7 @@
             </w:pPr>
             <w:r>
               <w:rPr/>
-              <w:t>{{ .</w:t>
-            </w:r>
-            <w:r>
-              <w:rPr/>
-              <w:t>Notes</w:t>
-            </w:r>
-            <w:r>
-              <w:rPr/>
-              <w:t xml:space="preserve"> }}</w:t>
+              <w:t>{{ .Notes }}</w:t>
             </w:r>
           </w:p>
         </w:tc>
@@ -621,7 +627,7 @@
         <w:trPr/>
         <w:tc>
           <w:tcPr>
-            <w:tcW w:w="9638" w:type="dxa"/>
+            <w:tcW w:w="9637" w:type="dxa"/>
             <w:gridSpan w:val="4"/>
             <w:tcBorders>
               <w:start w:val="single" w:sz="4" w:space="0" w:color="000000"/>
@@ -638,7 +644,7 @@
             </w:pPr>
             <w:r>
               <w:rPr/>
-              <w:t>{{tr end }}</w:t>
+              <w:t>{{ end }}</w:t>
             </w:r>
           </w:p>
         </w:tc>
@@ -676,7 +682,7 @@
       </w:pPr>
       <w:r>
         <w:rPr/>
-        <w:t>{{p range .Case.Assets }}</w:t>
+        <w:t>{{ range .Case.Assets }}</w:t>
       </w:r>
     </w:p>
     <w:p>
@@ -688,31 +694,7 @@
       </w:pPr>
       <w:r>
         <w:rPr/>
-        <w:t>{{p</w:t>
-      </w:r>
-      <w:r>
-        <w:rPr/>
-        <w:t xml:space="preserve"> </w:t>
-      </w:r>
-      <w:r>
-        <w:rPr/>
-        <w:t xml:space="preserve">if </w:t>
-      </w:r>
-      <w:r>
-        <w:rPr/>
-        <w:t xml:space="preserve">eq </w:t>
-      </w:r>
-      <w:r>
-        <w:rPr/>
-        <w:t>.</w:t>
-      </w:r>
-      <w:r>
-        <w:rPr/>
-        <w:t>Status “Compromised”</w:t>
-      </w:r>
-      <w:r>
-        <w:rPr/>
-        <w:t xml:space="preserve"> }}</w:t>
+        <w:t>{{ if eq .Status “Compromised” }}</w:t>
       </w:r>
     </w:p>
     <w:p>
@@ -740,7 +722,7 @@
       </w:pPr>
       <w:r>
         <w:rPr/>
-        <w:t>{{p end }}</w:t>
+        <w:t>{{ end }}</w:t>
       </w:r>
     </w:p>
     <w:p>
@@ -752,7 +734,7 @@
       </w:pPr>
       <w:r>
         <w:rPr/>
-        <w:t>{{p end }}</w:t>
+        <w:t>{{ end }}</w:t>
       </w:r>
       <w:r>
         <w:br w:type="page"/>
@@ -761,7 +743,12 @@
     <w:p>
       <w:pPr>
         <w:pStyle w:val="Heading1"/>
-        <w:bidi w:val="0"/>
+        <w:numPr>
+          <w:ilvl w:val="0"/>
+          <w:numId w:val="1"/>
+        </w:numPr>
+        <w:bidi w:val="0"/>
+        <w:spacing w:before="0" w:after="120"/>
         <w:ind w:hanging="0" w:start="0"/>
         <w:jc w:val="start"/>
         <w:rPr/>
@@ -898,7 +885,7 @@
             </w:pPr>
             <w:r>
               <w:rPr/>
-              <w:t>{{tr range .Case.Events }}</w:t>
+              <w:t>{{ range .Case.Events }}</w:t>
             </w:r>
           </w:p>
         </w:tc>
@@ -991,7 +978,7 @@
             </w:pPr>
             <w:r>
               <w:rPr/>
-              <w:t>{{tr end }}</w:t>
+              <w:t>{{ end }}</w:t>
             </w:r>
           </w:p>
         </w:tc>
@@ -1015,7 +1002,12 @@
     <w:p>
       <w:pPr>
         <w:pStyle w:val="Heading1"/>
-        <w:bidi w:val="0"/>
+        <w:numPr>
+          <w:ilvl w:val="0"/>
+          <w:numId w:val="1"/>
+        </w:numPr>
+        <w:bidi w:val="0"/>
+        <w:spacing w:before="0" w:after="120"/>
         <w:ind w:hanging="0" w:start="0"/>
         <w:jc w:val="start"/>
         <w:rPr/>
@@ -1164,7 +1156,7 @@
             </w:pPr>
             <w:r>
               <w:rPr/>
-              <w:t>{{tr range .Case.Evidences }}</w:t>
+              <w:t>{{ range .Case.Evidences }}</w:t>
             </w:r>
           </w:p>
         </w:tc>
@@ -1257,7 +1249,7 @@
             </w:pPr>
             <w:r>
               <w:rPr/>
-              <w:t>{{tr end }}</w:t>
+              <w:t>{{ end }}</w:t>
             </w:r>
           </w:p>
         </w:tc>
@@ -1280,7 +1272,12 @@
     <w:p>
       <w:pPr>
         <w:pStyle w:val="Heading1"/>
-        <w:bidi w:val="0"/>
+        <w:numPr>
+          <w:ilvl w:val="0"/>
+          <w:numId w:val="1"/>
+        </w:numPr>
+        <w:bidi w:val="0"/>
+        <w:spacing w:before="0" w:after="120"/>
         <w:ind w:hanging="0" w:start="0"/>
         <w:jc w:val="start"/>
         <w:rPr/>
@@ -1417,7 +1414,7 @@
             </w:pPr>
             <w:r>
               <w:rPr/>
-              <w:t>{{tr range .Case.Indicators }}</w:t>
+              <w:t>{{ range .Case.Indicators }}</w:t>
             </w:r>
           </w:p>
         </w:tc>
@@ -1484,15 +1481,7 @@
             </w:pPr>
             <w:r>
               <w:rPr/>
-              <w:t>{{ .</w:t>
-            </w:r>
-            <w:r>
-              <w:rPr/>
-              <w:t>Notes</w:t>
-            </w:r>
-            <w:r>
-              <w:rPr/>
-              <w:t xml:space="preserve"> }}</w:t>
+              <w:t>{{ .Notes }}</w:t>
             </w:r>
           </w:p>
         </w:tc>
@@ -1518,7 +1507,7 @@
             </w:pPr>
             <w:r>
               <w:rPr/>
-              <w:t>{{tr end }}</w:t>
+              <w:t>{{ end }}</w:t>
             </w:r>
           </w:p>
         </w:tc>
@@ -1554,7 +1543,6 @@
   <w:abstractNum w:abstractNumId="1">
     <w:lvl w:ilvl="0">
       <w:start w:val="1"/>
-      <w:pStyle w:val="Heading1"/>
       <w:numFmt w:val="none"/>
       <w:suff w:val="nothing"/>
       <w:lvlText w:val="%1"/>
@@ -1565,10 +1553,10 @@
         </w:tabs>
         <w:ind w:start="0" w:hanging="0"/>
       </w:pPr>
+      <w:rPr/>
     </w:lvl>
     <w:lvl w:ilvl="1">
       <w:start w:val="1"/>
-      <w:pStyle w:val="Heading2"/>
       <w:numFmt w:val="none"/>
       <w:suff w:val="nothing"/>
       <w:lvlText w:val="%2"/>
@@ -1579,6 +1567,7 @@
         </w:tabs>
         <w:ind w:start="0" w:hanging="0"/>
       </w:pPr>
+      <w:rPr/>
     </w:lvl>
     <w:lvl w:ilvl="2">
       <w:start w:val="1"/>
@@ -1592,6 +1581,7 @@
         </w:tabs>
         <w:ind w:start="0" w:hanging="0"/>
       </w:pPr>
+      <w:rPr/>
     </w:lvl>
     <w:lvl w:ilvl="3">
       <w:start w:val="1"/>
@@ -1605,6 +1595,7 @@
         </w:tabs>
         <w:ind w:start="0" w:hanging="0"/>
       </w:pPr>
+      <w:rPr/>
     </w:lvl>
     <w:lvl w:ilvl="4">
       <w:start w:val="1"/>
@@ -1618,6 +1609,7 @@
         </w:tabs>
         <w:ind w:start="0" w:hanging="0"/>
       </w:pPr>
+      <w:rPr/>
     </w:lvl>
     <w:lvl w:ilvl="5">
       <w:start w:val="1"/>
@@ -1631,6 +1623,7 @@
         </w:tabs>
         <w:ind w:start="0" w:hanging="0"/>
       </w:pPr>
+      <w:rPr/>
     </w:lvl>
     <w:lvl w:ilvl="6">
       <w:start w:val="1"/>
@@ -1644,6 +1637,7 @@
         </w:tabs>
         <w:ind w:start="0" w:hanging="0"/>
       </w:pPr>
+      <w:rPr/>
     </w:lvl>
     <w:lvl w:ilvl="7">
       <w:start w:val="1"/>
@@ -1657,6 +1651,7 @@
         </w:tabs>
         <w:ind w:start="0" w:hanging="0"/>
       </w:pPr>
+      <w:rPr/>
     </w:lvl>
     <w:lvl w:ilvl="8">
       <w:start w:val="1"/>
@@ -1670,6 +1665,7 @@
         </w:tabs>
         <w:ind w:start="0" w:hanging="0"/>
       </w:pPr>
+      <w:rPr/>
     </w:lvl>
   </w:abstractNum>
   <w:abstractNum w:abstractNumId="2">
@@ -1807,6 +1803,125 @@
       <w:rPr>
         <w:rFonts w:ascii="OpenSymbol" w:hAnsi="OpenSymbol" w:cs="OpenSymbol" w:hint="default"/>
       </w:rPr>
+    </w:lvl>
+  </w:abstractNum>
+  <w:abstractNum w:abstractNumId="3">
+    <w:lvl w:ilvl="0">
+      <w:start w:val="1"/>
+      <w:numFmt w:val="none"/>
+      <w:suff w:val="nothing"/>
+      <w:lvlText w:val=""/>
+      <w:lvlJc w:val="start"/>
+      <w:pPr>
+        <w:tabs>
+          <w:tab w:val="num" w:pos="0"/>
+        </w:tabs>
+        <w:ind w:start="0" w:hanging="0"/>
+      </w:pPr>
+    </w:lvl>
+    <w:lvl w:ilvl="1">
+      <w:start w:val="1"/>
+      <w:numFmt w:val="none"/>
+      <w:suff w:val="nothing"/>
+      <w:lvlText w:val=""/>
+      <w:lvlJc w:val="start"/>
+      <w:pPr>
+        <w:tabs>
+          <w:tab w:val="num" w:pos="0"/>
+        </w:tabs>
+        <w:ind w:start="0" w:hanging="0"/>
+      </w:pPr>
+    </w:lvl>
+    <w:lvl w:ilvl="2">
+      <w:start w:val="1"/>
+      <w:numFmt w:val="none"/>
+      <w:suff w:val="nothing"/>
+      <w:lvlText w:val=""/>
+      <w:lvlJc w:val="start"/>
+      <w:pPr>
+        <w:tabs>
+          <w:tab w:val="num" w:pos="0"/>
+        </w:tabs>
+        <w:ind w:start="0" w:hanging="0"/>
+      </w:pPr>
+    </w:lvl>
+    <w:lvl w:ilvl="3">
+      <w:start w:val="1"/>
+      <w:numFmt w:val="none"/>
+      <w:suff w:val="nothing"/>
+      <w:lvlText w:val=""/>
+      <w:lvlJc w:val="start"/>
+      <w:pPr>
+        <w:tabs>
+          <w:tab w:val="num" w:pos="0"/>
+        </w:tabs>
+        <w:ind w:start="0" w:hanging="0"/>
+      </w:pPr>
+    </w:lvl>
+    <w:lvl w:ilvl="4">
+      <w:start w:val="1"/>
+      <w:numFmt w:val="none"/>
+      <w:suff w:val="nothing"/>
+      <w:lvlText w:val=""/>
+      <w:lvlJc w:val="start"/>
+      <w:pPr>
+        <w:tabs>
+          <w:tab w:val="num" w:pos="0"/>
+        </w:tabs>
+        <w:ind w:start="0" w:hanging="0"/>
+      </w:pPr>
+    </w:lvl>
+    <w:lvl w:ilvl="5">
+      <w:start w:val="1"/>
+      <w:numFmt w:val="none"/>
+      <w:suff w:val="nothing"/>
+      <w:lvlText w:val=""/>
+      <w:lvlJc w:val="start"/>
+      <w:pPr>
+        <w:tabs>
+          <w:tab w:val="num" w:pos="0"/>
+        </w:tabs>
+        <w:ind w:start="0" w:hanging="0"/>
+      </w:pPr>
+    </w:lvl>
+    <w:lvl w:ilvl="6">
+      <w:start w:val="1"/>
+      <w:numFmt w:val="none"/>
+      <w:suff w:val="nothing"/>
+      <w:lvlText w:val=""/>
+      <w:lvlJc w:val="start"/>
+      <w:pPr>
+        <w:tabs>
+          <w:tab w:val="num" w:pos="0"/>
+        </w:tabs>
+        <w:ind w:start="0" w:hanging="0"/>
+      </w:pPr>
+    </w:lvl>
+    <w:lvl w:ilvl="7">
+      <w:start w:val="1"/>
+      <w:numFmt w:val="none"/>
+      <w:suff w:val="nothing"/>
+      <w:lvlText w:val=""/>
+      <w:lvlJc w:val="start"/>
+      <w:pPr>
+        <w:tabs>
+          <w:tab w:val="num" w:pos="0"/>
+        </w:tabs>
+        <w:ind w:start="0" w:hanging="0"/>
+      </w:pPr>
+    </w:lvl>
+    <w:lvl w:ilvl="8">
+      <w:start w:val="1"/>
+      <w:numFmt w:val="none"/>
+      <w:suff w:val="nothing"/>
+      <w:lvlText w:val=""/>
+      <w:lvlJc w:val="start"/>
+      <w:pPr>
+        <w:tabs>
+          <w:tab w:val="num" w:pos="0"/>
+        </w:tabs>
+        <w:ind w:start="0" w:hanging="0"/>
+      </w:pPr>
     </w:lvl>
   </w:abstractNum>
   <w:num w:numId="1">
@@ -1814,6 +1929,9 @@
   </w:num>
   <w:num w:numId="2">
     <w:abstractNumId w:val="2"/>
+  </w:num>
+  <w:num w:numId="3">
+    <w:abstractNumId w:val="3"/>
   </w:num>
 </w:numbering>
 </file>
@@ -1832,7 +1950,6 @@
     </w:rPrDefault>
     <w:pPrDefault>
       <w:pPr>
-        <w:widowControl/>
         <w:suppressAutoHyphens w:val="true"/>
       </w:pPr>
     </w:pPrDefault>
@@ -1842,10 +1959,11 @@
     <w:qFormat/>
     <w:pPr>
       <w:widowControl/>
-      <w:kinsoku w:val="true"/>
-      <w:overflowPunct w:val="true"/>
-      <w:autoSpaceDE w:val="true"/>
+      <w:suppressAutoHyphens w:val="true"/>
+      <w:overflowPunct w:val="false"/>
       <w:bidi w:val="0"/>
+      <w:spacing w:before="0" w:after="0"/>
+      <w:jc w:val="start"/>
     </w:pPr>
     <w:rPr>
       <w:rFonts w:ascii="Liberation Serif" w:hAnsi="Liberation Serif" w:eastAsia="Songti SC" w:cs="Arial Unicode MS"/>

</xml_diff>

<commit_message>
Add doct template helpers and report authoring guide
</commit_message>
<xml_diff>
--- a/templates/Demo Word Report.docx
+++ b/templates/Demo Word Report.docx
@@ -12,7 +12,7 @@
       </w:pPr>
       <w:r>
         <w:rPr/>
-        <w:t>{{ .Case.Name }}</w:t>
+        <w:t>{{ .Case.Name | xml }}</w:t>
       </w:r>
     </w:p>
     <w:p>
@@ -376,7 +376,7 @@
     </w:p>
     <w:tbl>
       <w:tblPr>
-        <w:tblW w:w="5000" w:type="pct"/>
+        <w:tblW w:w="9635" w:type="dxa"/>
         <w:jc w:val="start"/>
         <w:tblInd w:w="-5" w:type="dxa"/>
         <w:tblLayout w:type="fixed"/>
@@ -388,16 +388,16 @@
         </w:tblCellMar>
       </w:tblPr>
       <w:tblGrid>
-        <w:gridCol w:w="2409"/>
-        <w:gridCol w:w="2409"/>
+        <w:gridCol w:w="2551"/>
+        <w:gridCol w:w="2267"/>
         <w:gridCol w:w="2410"/>
-        <w:gridCol w:w="2409"/>
+        <w:gridCol w:w="2407"/>
       </w:tblGrid>
       <w:tr>
         <w:trPr/>
         <w:tc>
           <w:tcPr>
-            <w:tcW w:w="2409" w:type="dxa"/>
+            <w:tcW w:w="2551" w:type="dxa"/>
             <w:tcBorders>
               <w:top w:val="single" w:sz="4" w:space="0" w:color="000000"/>
               <w:start w:val="single" w:sz="4" w:space="0" w:color="000000"/>
@@ -425,7 +425,7 @@
         </w:tc>
         <w:tc>
           <w:tcPr>
-            <w:tcW w:w="2409" w:type="dxa"/>
+            <w:tcW w:w="2267" w:type="dxa"/>
             <w:tcBorders>
               <w:top w:val="single" w:sz="4" w:space="0" w:color="000000"/>
               <w:start w:val="single" w:sz="4" w:space="0" w:color="000000"/>
@@ -481,7 +481,7 @@
         </w:tc>
         <w:tc>
           <w:tcPr>
-            <w:tcW w:w="2409" w:type="dxa"/>
+            <w:tcW w:w="2407" w:type="dxa"/>
             <w:tcBorders>
               <w:top w:val="single" w:sz="4" w:space="0" w:color="000000"/>
               <w:start w:val="single" w:sz="4" w:space="0" w:color="000000"/>
@@ -513,8 +513,72 @@
         <w:trPr/>
         <w:tc>
           <w:tcPr>
-            <w:tcW w:w="9637" w:type="dxa"/>
-            <w:gridSpan w:val="4"/>
+            <w:tcW w:w="2551" w:type="dxa"/>
+            <w:tcBorders>
+              <w:start w:val="single" w:sz="4" w:space="0" w:color="000000"/>
+              <w:bottom w:val="single" w:sz="4" w:space="0" w:color="000000"/>
+            </w:tcBorders>
+          </w:tcPr>
+          <w:p>
+            <w:pPr>
+              <w:pStyle w:val="TableContents"/>
+              <w:bidi w:val="0"/>
+              <w:jc w:val="start"/>
+              <w:rPr/>
+            </w:pPr>
+            <w:r>
+              <w:rPr/>
+              <w:t>{{ range .Case.Assets }}</w:t>
+              <w:br/>
+              <w:t>{{ .Name | xml }}</w:t>
+            </w:r>
+          </w:p>
+        </w:tc>
+        <w:tc>
+          <w:tcPr>
+            <w:tcW w:w="2267" w:type="dxa"/>
+            <w:tcBorders>
+              <w:start w:val="single" w:sz="4" w:space="0" w:color="000000"/>
+              <w:bottom w:val="single" w:sz="4" w:space="0" w:color="000000"/>
+            </w:tcBorders>
+          </w:tcPr>
+          <w:p>
+            <w:pPr>
+              <w:pStyle w:val="TableContents"/>
+              <w:bidi w:val="0"/>
+              <w:jc w:val="start"/>
+              <w:rPr/>
+            </w:pPr>
+            <w:r>
+              <w:rPr/>
+              <w:t>{{ .Type | xml }}</w:t>
+            </w:r>
+          </w:p>
+        </w:tc>
+        <w:tc>
+          <w:tcPr>
+            <w:tcW w:w="2410" w:type="dxa"/>
+            <w:tcBorders>
+              <w:start w:val="single" w:sz="4" w:space="0" w:color="000000"/>
+              <w:bottom w:val="single" w:sz="4" w:space="0" w:color="000000"/>
+            </w:tcBorders>
+          </w:tcPr>
+          <w:p>
+            <w:pPr>
+              <w:pStyle w:val="TableContents"/>
+              <w:bidi w:val="0"/>
+              <w:jc w:val="start"/>
+              <w:rPr/>
+            </w:pPr>
+            <w:r>
+              <w:rPr/>
+              <w:t>{{ .Status | xml }}</w:t>
+            </w:r>
+          </w:p>
+        </w:tc>
+        <w:tc>
+          <w:tcPr>
+            <w:tcW w:w="2407" w:type="dxa"/>
             <w:tcBorders>
               <w:start w:val="single" w:sz="4" w:space="0" w:color="000000"/>
               <w:bottom w:val="single" w:sz="4" w:space="0" w:color="000000"/>
@@ -530,120 +594,8 @@
             </w:pPr>
             <w:r>
               <w:rPr/>
-              <w:t>{{ range .Case.Assets }}</w:t>
-            </w:r>
-          </w:p>
-        </w:tc>
-      </w:tr>
-      <w:tr>
-        <w:trPr/>
-        <w:tc>
-          <w:tcPr>
-            <w:tcW w:w="2409" w:type="dxa"/>
-            <w:tcBorders>
-              <w:start w:val="single" w:sz="4" w:space="0" w:color="000000"/>
-              <w:bottom w:val="single" w:sz="4" w:space="0" w:color="000000"/>
-            </w:tcBorders>
-          </w:tcPr>
-          <w:p>
-            <w:pPr>
-              <w:pStyle w:val="TableContents"/>
-              <w:bidi w:val="0"/>
-              <w:jc w:val="start"/>
-              <w:rPr/>
-            </w:pPr>
-            <w:r>
-              <w:rPr/>
-              <w:t>{{ .Name }}</w:t>
-            </w:r>
-          </w:p>
-        </w:tc>
-        <w:tc>
-          <w:tcPr>
-            <w:tcW w:w="2409" w:type="dxa"/>
-            <w:tcBorders>
-              <w:start w:val="single" w:sz="4" w:space="0" w:color="000000"/>
-              <w:bottom w:val="single" w:sz="4" w:space="0" w:color="000000"/>
-            </w:tcBorders>
-          </w:tcPr>
-          <w:p>
-            <w:pPr>
-              <w:pStyle w:val="TableContents"/>
-              <w:bidi w:val="0"/>
-              <w:jc w:val="start"/>
-              <w:rPr/>
-            </w:pPr>
-            <w:r>
-              <w:rPr/>
-              <w:t>{{ .Type }}</w:t>
-            </w:r>
-          </w:p>
-        </w:tc>
-        <w:tc>
-          <w:tcPr>
-            <w:tcW w:w="2410" w:type="dxa"/>
-            <w:tcBorders>
-              <w:start w:val="single" w:sz="4" w:space="0" w:color="000000"/>
-              <w:bottom w:val="single" w:sz="4" w:space="0" w:color="000000"/>
-            </w:tcBorders>
-          </w:tcPr>
-          <w:p>
-            <w:pPr>
-              <w:pStyle w:val="TableContents"/>
-              <w:bidi w:val="0"/>
-              <w:jc w:val="start"/>
-              <w:rPr/>
-            </w:pPr>
-            <w:r>
-              <w:rPr/>
-              <w:t>{{ .Status }}</w:t>
-            </w:r>
-          </w:p>
-        </w:tc>
-        <w:tc>
-          <w:tcPr>
-            <w:tcW w:w="2409" w:type="dxa"/>
-            <w:tcBorders>
-              <w:start w:val="single" w:sz="4" w:space="0" w:color="000000"/>
-              <w:bottom w:val="single" w:sz="4" w:space="0" w:color="000000"/>
-              <w:end w:val="single" w:sz="4" w:space="0" w:color="000000"/>
-            </w:tcBorders>
-          </w:tcPr>
-          <w:p>
-            <w:pPr>
-              <w:pStyle w:val="TableContents"/>
-              <w:bidi w:val="0"/>
-              <w:jc w:val="start"/>
-              <w:rPr/>
-            </w:pPr>
-            <w:r>
-              <w:rPr/>
-              <w:t>{{ .Notes }}</w:t>
-            </w:r>
-          </w:p>
-        </w:tc>
-      </w:tr>
-      <w:tr>
-        <w:trPr/>
-        <w:tc>
-          <w:tcPr>
-            <w:tcW w:w="9637" w:type="dxa"/>
-            <w:gridSpan w:val="4"/>
-            <w:tcBorders>
-              <w:start w:val="single" w:sz="4" w:space="0" w:color="000000"/>
-              <w:bottom w:val="single" w:sz="4" w:space="0" w:color="000000"/>
-              <w:end w:val="single" w:sz="4" w:space="0" w:color="000000"/>
-            </w:tcBorders>
-          </w:tcPr>
-          <w:p>
-            <w:pPr>
-              <w:pStyle w:val="TableContents"/>
-              <w:bidi w:val="0"/>
-              <w:jc w:val="start"/>
-              <w:rPr/>
-            </w:pPr>
-            <w:r>
-              <w:rPr/>
+              <w:t>{{ .Notes | xml }}</w:t>
+              <w:br/>
               <w:t>{{ end }}</w:t>
             </w:r>
           </w:p>
@@ -710,7 +662,7 @@
       </w:pPr>
       <w:r>
         <w:rPr/>
-        <w:t>{{ .Name }}</w:t>
+        <w:t>{{ .Name | xml }}</w:t>
       </w:r>
     </w:p>
     <w:p>
@@ -868,8 +820,51 @@
         <w:trPr/>
         <w:tc>
           <w:tcPr>
-            <w:tcW w:w="9633" w:type="dxa"/>
-            <w:gridSpan w:val="3"/>
+            <w:tcW w:w="3211" w:type="dxa"/>
+            <w:tcBorders>
+              <w:start w:val="single" w:sz="4" w:space="0" w:color="000000"/>
+              <w:bottom w:val="single" w:sz="4" w:space="0" w:color="000000"/>
+            </w:tcBorders>
+          </w:tcPr>
+          <w:p>
+            <w:pPr>
+              <w:pStyle w:val="TableContents"/>
+              <w:bidi w:val="0"/>
+              <w:jc w:val="start"/>
+              <w:rPr/>
+            </w:pPr>
+            <w:r>
+              <w:rPr/>
+              <w:t>{{ range .Case.Events }}</w:t>
+              <w:br/>
+              <w:t>{{ .Time.Format “2006-01-02 15:04:05” }}</w:t>
+            </w:r>
+          </w:p>
+        </w:tc>
+        <w:tc>
+          <w:tcPr>
+            <w:tcW w:w="3211" w:type="dxa"/>
+            <w:tcBorders>
+              <w:start w:val="single" w:sz="4" w:space="0" w:color="000000"/>
+              <w:bottom w:val="single" w:sz="4" w:space="0" w:color="000000"/>
+            </w:tcBorders>
+          </w:tcPr>
+          <w:p>
+            <w:pPr>
+              <w:pStyle w:val="TableContents"/>
+              <w:bidi w:val="0"/>
+              <w:jc w:val="start"/>
+              <w:rPr/>
+            </w:pPr>
+            <w:r>
+              <w:rPr/>
+              <w:t>{{ .Type | xml }}</w:t>
+            </w:r>
+          </w:p>
+        </w:tc>
+        <w:tc>
+          <w:tcPr>
+            <w:tcW w:w="3211" w:type="dxa"/>
             <w:tcBorders>
               <w:start w:val="single" w:sz="4" w:space="0" w:color="000000"/>
               <w:bottom w:val="single" w:sz="4" w:space="0" w:color="000000"/>
@@ -885,99 +880,8 @@
             </w:pPr>
             <w:r>
               <w:rPr/>
-              <w:t>{{ range .Case.Events }}</w:t>
-            </w:r>
-          </w:p>
-        </w:tc>
-      </w:tr>
-      <w:tr>
-        <w:trPr/>
-        <w:tc>
-          <w:tcPr>
-            <w:tcW w:w="3211" w:type="dxa"/>
-            <w:tcBorders>
-              <w:start w:val="single" w:sz="4" w:space="0" w:color="000000"/>
-              <w:bottom w:val="single" w:sz="4" w:space="0" w:color="000000"/>
-            </w:tcBorders>
-          </w:tcPr>
-          <w:p>
-            <w:pPr>
-              <w:pStyle w:val="TableContents"/>
-              <w:bidi w:val="0"/>
-              <w:jc w:val="start"/>
-              <w:rPr/>
-            </w:pPr>
-            <w:r>
-              <w:rPr/>
-              <w:t>{{ .Time.Format “2006-01-02 15:04:05” }}</w:t>
-            </w:r>
-          </w:p>
-        </w:tc>
-        <w:tc>
-          <w:tcPr>
-            <w:tcW w:w="3211" w:type="dxa"/>
-            <w:tcBorders>
-              <w:start w:val="single" w:sz="4" w:space="0" w:color="000000"/>
-              <w:bottom w:val="single" w:sz="4" w:space="0" w:color="000000"/>
-            </w:tcBorders>
-          </w:tcPr>
-          <w:p>
-            <w:pPr>
-              <w:pStyle w:val="TableContents"/>
-              <w:bidi w:val="0"/>
-              <w:jc w:val="start"/>
-              <w:rPr/>
-            </w:pPr>
-            <w:r>
-              <w:rPr/>
-              <w:t>{{ .Type }}</w:t>
-            </w:r>
-          </w:p>
-        </w:tc>
-        <w:tc>
-          <w:tcPr>
-            <w:tcW w:w="3211" w:type="dxa"/>
-            <w:tcBorders>
-              <w:start w:val="single" w:sz="4" w:space="0" w:color="000000"/>
-              <w:bottom w:val="single" w:sz="4" w:space="0" w:color="000000"/>
-              <w:end w:val="single" w:sz="4" w:space="0" w:color="000000"/>
-            </w:tcBorders>
-          </w:tcPr>
-          <w:p>
-            <w:pPr>
-              <w:pStyle w:val="TableContents"/>
-              <w:bidi w:val="0"/>
-              <w:jc w:val="start"/>
-              <w:rPr/>
-            </w:pPr>
-            <w:r>
-              <w:rPr/>
-              <w:t>{{ .Event}}</w:t>
-            </w:r>
-          </w:p>
-        </w:tc>
-      </w:tr>
-      <w:tr>
-        <w:trPr/>
-        <w:tc>
-          <w:tcPr>
-            <w:tcW w:w="9633" w:type="dxa"/>
-            <w:gridSpan w:val="3"/>
-            <w:tcBorders>
-              <w:start w:val="single" w:sz="4" w:space="0" w:color="000000"/>
-              <w:bottom w:val="single" w:sz="4" w:space="0" w:color="000000"/>
-              <w:end w:val="single" w:sz="4" w:space="0" w:color="000000"/>
-            </w:tcBorders>
-          </w:tcPr>
-          <w:p>
-            <w:pPr>
-              <w:pStyle w:val="TableContents"/>
-              <w:bidi w:val="0"/>
-              <w:jc w:val="start"/>
-              <w:rPr/>
-            </w:pPr>
-            <w:r>
-              <w:rPr/>
+              <w:t>{{ .Event | xml }}</w:t>
+              <w:br/>
               <w:t>{{ end }}</w:t>
             </w:r>
           </w:p>
@@ -1139,8 +1043,51 @@
         <w:trPr/>
         <w:tc>
           <w:tcPr>
-            <w:tcW w:w="9638" w:type="dxa"/>
-            <w:gridSpan w:val="3"/>
+            <w:tcW w:w="3212" w:type="dxa"/>
+            <w:tcBorders>
+              <w:start w:val="single" w:sz="4" w:space="0" w:color="000000"/>
+              <w:bottom w:val="single" w:sz="4" w:space="0" w:color="000000"/>
+            </w:tcBorders>
+          </w:tcPr>
+          <w:p>
+            <w:pPr>
+              <w:pStyle w:val="TableContents"/>
+              <w:bidi w:val="0"/>
+              <w:jc w:val="start"/>
+              <w:rPr/>
+            </w:pPr>
+            <w:r>
+              <w:rPr/>
+              <w:t>{{ range .Case.Evidences }}</w:t>
+              <w:br/>
+              <w:t>{{ .Name | xml }}</w:t>
+            </w:r>
+          </w:p>
+        </w:tc>
+        <w:tc>
+          <w:tcPr>
+            <w:tcW w:w="3213" w:type="dxa"/>
+            <w:tcBorders>
+              <w:start w:val="single" w:sz="4" w:space="0" w:color="000000"/>
+              <w:bottom w:val="single" w:sz="4" w:space="0" w:color="000000"/>
+            </w:tcBorders>
+          </w:tcPr>
+          <w:p>
+            <w:pPr>
+              <w:pStyle w:val="TableContents"/>
+              <w:bidi w:val="0"/>
+              <w:jc w:val="start"/>
+              <w:rPr/>
+            </w:pPr>
+            <w:r>
+              <w:rPr/>
+              <w:t>{{ .Hash | xml }}</w:t>
+            </w:r>
+          </w:p>
+        </w:tc>
+        <w:tc>
+          <w:tcPr>
+            <w:tcW w:w="3213" w:type="dxa"/>
             <w:tcBorders>
               <w:start w:val="single" w:sz="4" w:space="0" w:color="000000"/>
               <w:bottom w:val="single" w:sz="4" w:space="0" w:color="000000"/>
@@ -1156,99 +1103,8 @@
             </w:pPr>
             <w:r>
               <w:rPr/>
-              <w:t>{{ range .Case.Evidences }}</w:t>
-            </w:r>
-          </w:p>
-        </w:tc>
-      </w:tr>
-      <w:tr>
-        <w:trPr/>
-        <w:tc>
-          <w:tcPr>
-            <w:tcW w:w="3212" w:type="dxa"/>
-            <w:tcBorders>
-              <w:start w:val="single" w:sz="4" w:space="0" w:color="000000"/>
-              <w:bottom w:val="single" w:sz="4" w:space="0" w:color="000000"/>
-            </w:tcBorders>
-          </w:tcPr>
-          <w:p>
-            <w:pPr>
-              <w:pStyle w:val="TableContents"/>
-              <w:bidi w:val="0"/>
-              <w:jc w:val="start"/>
-              <w:rPr/>
-            </w:pPr>
-            <w:r>
-              <w:rPr/>
-              <w:t>{{ .Name }}</w:t>
-            </w:r>
-          </w:p>
-        </w:tc>
-        <w:tc>
-          <w:tcPr>
-            <w:tcW w:w="3213" w:type="dxa"/>
-            <w:tcBorders>
-              <w:start w:val="single" w:sz="4" w:space="0" w:color="000000"/>
-              <w:bottom w:val="single" w:sz="4" w:space="0" w:color="000000"/>
-            </w:tcBorders>
-          </w:tcPr>
-          <w:p>
-            <w:pPr>
-              <w:pStyle w:val="TableContents"/>
-              <w:bidi w:val="0"/>
-              <w:jc w:val="start"/>
-              <w:rPr/>
-            </w:pPr>
-            <w:r>
-              <w:rPr/>
-              <w:t>{{ .Hash }}</w:t>
-            </w:r>
-          </w:p>
-        </w:tc>
-        <w:tc>
-          <w:tcPr>
-            <w:tcW w:w="3213" w:type="dxa"/>
-            <w:tcBorders>
-              <w:start w:val="single" w:sz="4" w:space="0" w:color="000000"/>
-              <w:bottom w:val="single" w:sz="4" w:space="0" w:color="000000"/>
-              <w:end w:val="single" w:sz="4" w:space="0" w:color="000000"/>
-            </w:tcBorders>
-          </w:tcPr>
-          <w:p>
-            <w:pPr>
-              <w:pStyle w:val="TableContents"/>
-              <w:bidi w:val="0"/>
-              <w:jc w:val="start"/>
-              <w:rPr/>
-            </w:pPr>
-            <w:r>
-              <w:rPr/>
-              <w:t>{{ .Notes }}</w:t>
-            </w:r>
-          </w:p>
-        </w:tc>
-      </w:tr>
-      <w:tr>
-        <w:trPr/>
-        <w:tc>
-          <w:tcPr>
-            <w:tcW w:w="9638" w:type="dxa"/>
-            <w:gridSpan w:val="3"/>
-            <w:tcBorders>
-              <w:start w:val="single" w:sz="4" w:space="0" w:color="000000"/>
-              <w:bottom w:val="single" w:sz="4" w:space="0" w:color="000000"/>
-              <w:end w:val="single" w:sz="4" w:space="0" w:color="000000"/>
-            </w:tcBorders>
-          </w:tcPr>
-          <w:p>
-            <w:pPr>
-              <w:pStyle w:val="TableContents"/>
-              <w:bidi w:val="0"/>
-              <w:jc w:val="start"/>
-              <w:rPr/>
-            </w:pPr>
-            <w:r>
-              <w:rPr/>
+              <w:t>{{ .Notes | xml }}</w:t>
+              <w:br/>
               <w:t>{{ end }}</w:t>
             </w:r>
           </w:p>
@@ -1397,8 +1253,51 @@
         <w:trPr/>
         <w:tc>
           <w:tcPr>
-            <w:tcW w:w="9638" w:type="dxa"/>
-            <w:gridSpan w:val="3"/>
+            <w:tcW w:w="3212" w:type="dxa"/>
+            <w:tcBorders>
+              <w:start w:val="single" w:sz="4" w:space="0" w:color="000000"/>
+              <w:bottom w:val="single" w:sz="4" w:space="0" w:color="000000"/>
+            </w:tcBorders>
+          </w:tcPr>
+          <w:p>
+            <w:pPr>
+              <w:pStyle w:val="TableContents"/>
+              <w:bidi w:val="0"/>
+              <w:jc w:val="start"/>
+              <w:rPr/>
+            </w:pPr>
+            <w:r>
+              <w:rPr/>
+              <w:t>{{ range .Case.Indicators }}</w:t>
+              <w:br/>
+              <w:t>{{ .Type | xml }}</w:t>
+            </w:r>
+          </w:p>
+        </w:tc>
+        <w:tc>
+          <w:tcPr>
+            <w:tcW w:w="3213" w:type="dxa"/>
+            <w:tcBorders>
+              <w:start w:val="single" w:sz="4" w:space="0" w:color="000000"/>
+              <w:bottom w:val="single" w:sz="4" w:space="0" w:color="000000"/>
+            </w:tcBorders>
+          </w:tcPr>
+          <w:p>
+            <w:pPr>
+              <w:pStyle w:val="TableContents"/>
+              <w:bidi w:val="0"/>
+              <w:jc w:val="start"/>
+              <w:rPr/>
+            </w:pPr>
+            <w:r>
+              <w:rPr/>
+              <w:t>{{ .Value | xml }}</w:t>
+            </w:r>
+          </w:p>
+        </w:tc>
+        <w:tc>
+          <w:tcPr>
+            <w:tcW w:w="3213" w:type="dxa"/>
             <w:tcBorders>
               <w:start w:val="single" w:sz="4" w:space="0" w:color="000000"/>
               <w:bottom w:val="single" w:sz="4" w:space="0" w:color="000000"/>
@@ -1414,99 +1313,8 @@
             </w:pPr>
             <w:r>
               <w:rPr/>
-              <w:t>{{ range .Case.Indicators }}</w:t>
-            </w:r>
-          </w:p>
-        </w:tc>
-      </w:tr>
-      <w:tr>
-        <w:trPr/>
-        <w:tc>
-          <w:tcPr>
-            <w:tcW w:w="3212" w:type="dxa"/>
-            <w:tcBorders>
-              <w:start w:val="single" w:sz="4" w:space="0" w:color="000000"/>
-              <w:bottom w:val="single" w:sz="4" w:space="0" w:color="000000"/>
-            </w:tcBorders>
-          </w:tcPr>
-          <w:p>
-            <w:pPr>
-              <w:pStyle w:val="TableContents"/>
-              <w:bidi w:val="0"/>
-              <w:jc w:val="start"/>
-              <w:rPr/>
-            </w:pPr>
-            <w:r>
-              <w:rPr/>
-              <w:t>{{ .Type }}</w:t>
-            </w:r>
-          </w:p>
-        </w:tc>
-        <w:tc>
-          <w:tcPr>
-            <w:tcW w:w="3213" w:type="dxa"/>
-            <w:tcBorders>
-              <w:start w:val="single" w:sz="4" w:space="0" w:color="000000"/>
-              <w:bottom w:val="single" w:sz="4" w:space="0" w:color="000000"/>
-            </w:tcBorders>
-          </w:tcPr>
-          <w:p>
-            <w:pPr>
-              <w:pStyle w:val="TableContents"/>
-              <w:bidi w:val="0"/>
-              <w:jc w:val="start"/>
-              <w:rPr/>
-            </w:pPr>
-            <w:r>
-              <w:rPr/>
-              <w:t>{{ .Value }}</w:t>
-            </w:r>
-          </w:p>
-        </w:tc>
-        <w:tc>
-          <w:tcPr>
-            <w:tcW w:w="3213" w:type="dxa"/>
-            <w:tcBorders>
-              <w:start w:val="single" w:sz="4" w:space="0" w:color="000000"/>
-              <w:bottom w:val="single" w:sz="4" w:space="0" w:color="000000"/>
-              <w:end w:val="single" w:sz="4" w:space="0" w:color="000000"/>
-            </w:tcBorders>
-          </w:tcPr>
-          <w:p>
-            <w:pPr>
-              <w:pStyle w:val="TableContents"/>
-              <w:bidi w:val="0"/>
-              <w:jc w:val="start"/>
-              <w:rPr/>
-            </w:pPr>
-            <w:r>
-              <w:rPr/>
-              <w:t>{{ .Notes }}</w:t>
-            </w:r>
-          </w:p>
-        </w:tc>
-      </w:tr>
-      <w:tr>
-        <w:trPr/>
-        <w:tc>
-          <w:tcPr>
-            <w:tcW w:w="9638" w:type="dxa"/>
-            <w:gridSpan w:val="3"/>
-            <w:tcBorders>
-              <w:start w:val="single" w:sz="4" w:space="0" w:color="000000"/>
-              <w:bottom w:val="single" w:sz="4" w:space="0" w:color="000000"/>
-              <w:end w:val="single" w:sz="4" w:space="0" w:color="000000"/>
-            </w:tcBorders>
-          </w:tcPr>
-          <w:p>
-            <w:pPr>
-              <w:pStyle w:val="TableContents"/>
-              <w:bidi w:val="0"/>
-              <w:jc w:val="start"/>
-              <w:rPr/>
-            </w:pPr>
-            <w:r>
-              <w:rPr/>
+              <w:t>{{ .Notes | xml }}</w:t>
+              <w:br/>
               <w:t>{{ end }}</w:t>
             </w:r>
           </w:p>

</xml_diff>